<commit_message>
fix: improve template error logging and add template creation instructions
- Add detailed logging for all individual template errors
- Log error names and properties for better debugging
- Create script with instructions for manual template creation
- Help identify specific placeholder issues in DOCX template
</commit_message>
<xml_diff>
--- a/public/report-template.docx
+++ b/public/report-template.docx
@@ -3,311 +3,51 @@
 <w:document xmlns:wpc="http://schemas.microsoft.com/office/word/2010/wordprocessingCanvas" xmlns:cx="http://schemas.microsoft.com/office/drawing/2014/chartex" xmlns:cx1="http://schemas.microsoft.com/office/drawing/2015/9/8/chartex" xmlns:cx2="http://schemas.microsoft.com/office/drawing/2015/10/21/chartex" xmlns:cx3="http://schemas.microsoft.com/office/drawing/2016/5/9/chartex" xmlns:cx4="http://schemas.microsoft.com/office/drawing/2016/5/10/chartex" xmlns:cx5="http://schemas.microsoft.com/office/drawing/2016/5/11/chartex" xmlns:cx6="http://schemas.microsoft.com/office/drawing/2016/5/12/chartex" xmlns:cx7="http://schemas.microsoft.com/office/drawing/2016/5/13/chartex" xmlns:cx8="http://schemas.microsoft.com/office/drawing/2016/5/14/chartex" xmlns:mc="http://schemas.openxmlformats.org/markup-compatibility/2006" xmlns:aink="http://schemas.microsoft.com/office/drawing/2016/ink" xmlns:am3d="http://schemas.microsoft.com/office/drawing/2017/model3d" xmlns:o="urn:schemas-microsoft-com:office:office" xmlns:oel="http://schemas.microsoft.com/office/2019/extlst" xmlns:r="http://schemas.openxmlformats.org/officeDocument/2006/relationships" xmlns:m="http://schemas.openxmlformats.org/officeDocument/2006/math" xmlns:v="urn:schemas-microsoft-com:vml" xmlns:wp14="http://schemas.microsoft.com/office/word/2010/wordprocessingDrawing" xmlns:wp="http://schemas.openxmlformats.org/drawingml/2006/wordprocessingDrawing" xmlns:w10="urn:schemas-microsoft-com:office:word" xmlns:w="http://schemas.openxmlformats.org/wordprocessingml/2006/main" xmlns:w14="http://schemas.microsoft.com/office/word/2010/wordml" xmlns:w15="http://schemas.microsoft.com/office/word/2012/wordml" xmlns:w16cex="http://schemas.microsoft.com/office/word/2018/wordml/cex" xmlns:w16cid="http://schemas.microsoft.com/office/word/2016/wordml/cid" xmlns:w16="http://schemas.microsoft.com/office/word/2018/wordml" xmlns:w16du="http://schemas.microsoft.com/office/word/2023/wordml/word16du" xmlns:w16sdtdh="http://schemas.microsoft.com/office/word/2020/wordml/sdtdatahash" xmlns:w16sdtfl="http://schemas.microsoft.com/office/word/2024/wordml/sdtformatlock" xmlns:w16se="http://schemas.microsoft.com/office/word/2015/wordml/symex" xmlns:wpg="http://schemas.microsoft.com/office/word/2010/wordprocessingGroup" xmlns:wpi="http://schemas.microsoft.com/office/word/2010/wordprocessingInk" xmlns:wne="http://schemas.microsoft.com/office/word/2006/wordml" xmlns:wps="http://schemas.microsoft.com/office/word/2010/wordprocessingShape" mc:Ignorable="w14 w15 w16se w16cid w16 w16cex w16sdtdh w16sdtfl w16du wp14">
   <w:body>
     <w:p>
-      <w:pPr>
-        <w:jc w:val="center"/>
-      </w:pPr>
       <w:r>
-        <w:rPr>
-          <w:noProof/>
-        </w:rPr>
-        <w:drawing>
-          <wp:anchor distT="0" distB="0" distL="114300" distR="114300" simplePos="0" relativeHeight="251658240" behindDoc="0" locked="0" layoutInCell="1" allowOverlap="1" wp14:anchorId="01764014" wp14:editId="49B5481F">
-            <wp:simplePos x="0" y="0"/>
-            <wp:positionH relativeFrom="margin">
-              <wp:align>center</wp:align>
-            </wp:positionH>
-            <wp:positionV relativeFrom="paragraph">
-              <wp:posOffset>-775617</wp:posOffset>
-            </wp:positionV>
-            <wp:extent cx="4140200" cy="3136900"/>
-            <wp:effectExtent l="0" t="0" r="0" b="0"/>
-            <wp:wrapNone/>
-            <wp:docPr id="244501243" name="Picture 1"/>
-            <wp:cNvGraphicFramePr>
-              <a:graphicFrameLocks xmlns:a="http://schemas.openxmlformats.org/drawingml/2006/main" noChangeAspect="1"/>
-            </wp:cNvGraphicFramePr>
-            <a:graphic xmlns:a="http://schemas.openxmlformats.org/drawingml/2006/main">
-              <a:graphicData uri="http://schemas.openxmlformats.org/drawingml/2006/picture">
-                <pic:pic xmlns:pic="http://schemas.openxmlformats.org/drawingml/2006/picture">
-                  <pic:nvPicPr>
-                    <pic:cNvPr id="244501243" name="Picture 244501243"/>
-                    <pic:cNvPicPr/>
-                  </pic:nvPicPr>
-                  <pic:blipFill>
-                    <a:blip r:embed="rId4">
-                      <a:extLst>
-                        <a:ext uri="{28A0092B-C50C-407E-A947-70E740481C1C}">
-                          <a14:useLocalDpi xmlns:a14="http://schemas.microsoft.com/office/drawing/2010/main" val="0"/>
-                        </a:ext>
-                      </a:extLst>
-                    </a:blip>
-                    <a:stretch>
-                      <a:fillRect/>
-                    </a:stretch>
-                  </pic:blipFill>
-                  <pic:spPr>
-                    <a:xfrm>
-                      <a:off x="0" y="0"/>
-                      <a:ext cx="4140200" cy="3136900"/>
-                    </a:xfrm>
-                    <a:prstGeom prst="rect">
-                      <a:avLst/>
-                    </a:prstGeom>
-                  </pic:spPr>
-                </pic:pic>
-              </a:graphicData>
-            </a:graphic>
-            <wp14:sizeRelH relativeFrom="page">
-              <wp14:pctWidth>0</wp14:pctWidth>
-            </wp14:sizeRelH>
-            <wp14:sizeRelV relativeFrom="page">
-              <wp14:pctHeight>0</wp14:pctHeight>
-            </wp14:sizeRelV>
-          </wp:anchor>
-        </w:drawing>
-      </w:r>
-      <w:r>
-        <w:br/>
-      </w:r>
-      <w:r>
-        <w:br/>
-      </w:r>
-      <w:r>
-        <w:br/>
-      </w:r>
-      <w:r>
-        <w:br/>
-      </w:r>
-      <w:r>
-        <w:br/>
-      </w:r>
-      <w:r>
-        <w:br/>
-      </w:r>
-      <w:r>
-        <w:br/>
-      </w:r>
-      <w:r>
-        <w:br/>
-      </w:r>
-      <w:r>
-        <w:br/>
-      </w:r>
-      <w:r>
-        <w:br/>
-      </w:r>
-      <w:r>
-        <w:br/>
-      </w:r>
-      <w:r>
-        <w:br/>
-      </w:r>
-      <w:r>
-        <w:br/>
+        <w:t>Board Member Report</w:t>
       </w:r>
     </w:p>
     <w:p>
-      <w:pPr>
-        <w:jc w:val="center"/>
-        <w:rPr>
-          <w:b/>
-          <w:bCs/>
-          <w:sz w:val="60"/>
-          <w:szCs w:val="60"/>
-        </w:rPr>
-      </w:pPr>
       <w:r>
-        <w:rPr>
-          <w:b/>
-          <w:bCs/>
-          <w:sz w:val="60"/>
-          <w:szCs w:val="60"/>
-        </w:rPr>
-        <w:t>MESAQ COMMUNITY REPORT</w:t>
+        <w:t>Date: {{date}}</w:t>
+      </w:r>
+    </w:p>
+    <w:p/>
+    <w:p>
+      <w:r>
+        <w:t>Member List:</w:t>
       </w:r>
     </w:p>
     <w:p>
-      <w:pPr>
-        <w:jc w:val="center"/>
-        <w:rPr>
-          <w:b/>
-          <w:bCs/>
-          <w:sz w:val="60"/>
-          <w:szCs w:val="60"/>
-        </w:rPr>
-      </w:pPr>
       <w:r>
-        <w:rPr>
-          <w:b/>
-          <w:bCs/>
-          <w:sz w:val="60"/>
-          <w:szCs w:val="60"/>
-        </w:rPr>
-        <w:t>{{date}}</w:t>
+        <w:t>{{#member-table-loop}}</w:t>
       </w:r>
     </w:p>
-    <w:p/>
-    <w:p/>
-    <w:p/>
-    <w:p/>
-    <w:p/>
-    <w:p/>
-    <w:p/>
-    <w:p/>
-    <w:p/>
-    <w:p/>
-    <w:p/>
-    <w:p/>
     <w:p>
-      <w:pPr>
-        <w:rPr>
-          <w:sz w:val="40"/>
-          <w:szCs w:val="40"/>
-        </w:rPr>
-      </w:pPr>
       <w:r>
-        <w:rPr>
-          <w:sz w:val="40"/>
-          <w:szCs w:val="40"/>
-        </w:rPr>
-        <w:lastRenderedPageBreak/>
-        <w:t>Member Balances</w:t>
+        <w:t>ID: {{member-id}}</w:t>
       </w:r>
     </w:p>
-    <w:p/>
-    <w:tbl>
-      <w:tblPr>
-        <w:tblStyle w:val="TableGrid"/>
-        <w:tblW w:w="0" w:type="auto"/>
-        <w:tblLook w:val="04A0" w:firstRow="1" w:lastRow="0" w:firstColumn="1" w:lastColumn="0" w:noHBand="0" w:noVBand="1"/>
-      </w:tblPr>
-      <w:tblGrid>
-        <w:gridCol w:w="1910"/>
-        <w:gridCol w:w="4499"/>
-        <w:gridCol w:w="2941"/>
-      </w:tblGrid>
-      <w:tr>
-        <w:tc>
-          <w:tcPr>
-            <w:tcW w:w="1705" w:type="dxa"/>
-            <w:shd w:val="clear" w:color="auto" w:fill="32AF4D"/>
-          </w:tcPr>
-          <w:p>
-            <w:pPr>
-              <w:rPr>
-                <w:sz w:val="32"/>
-                <w:szCs w:val="32"/>
-              </w:rPr>
-            </w:pPr>
-            <w:r>
-              <w:rPr>
-                <w:sz w:val="32"/>
-                <w:szCs w:val="32"/>
-              </w:rPr>
-              <w:t>Member ID</w:t>
-            </w:r>
-          </w:p>
-        </w:tc>
-        <w:tc>
-          <w:tcPr>
-            <w:tcW w:w="4679" w:type="dxa"/>
-            <w:shd w:val="clear" w:color="auto" w:fill="32AF4D"/>
-          </w:tcPr>
-          <w:p>
-            <w:pPr>
-              <w:rPr>
-                <w:sz w:val="32"/>
-                <w:szCs w:val="32"/>
-              </w:rPr>
-            </w:pPr>
-            <w:r>
-              <w:rPr>
-                <w:sz w:val="32"/>
-                <w:szCs w:val="32"/>
-              </w:rPr>
-              <w:t>Member Name</w:t>
-            </w:r>
-          </w:p>
-        </w:tc>
-        <w:tc>
-          <w:tcPr>
-            <w:tcW w:w="2966" w:type="dxa"/>
-            <w:shd w:val="clear" w:color="auto" w:fill="32AF4D"/>
-          </w:tcPr>
-          <w:p>
-            <w:pPr>
-              <w:rPr>
-                <w:sz w:val="32"/>
-                <w:szCs w:val="32"/>
-              </w:rPr>
-            </w:pPr>
-            <w:r>
-              <w:rPr>
-                <w:sz w:val="32"/>
-                <w:szCs w:val="32"/>
-              </w:rPr>
-              <w:t>Balance</w:t>
-            </w:r>
-          </w:p>
-        </w:tc>
-      </w:tr>
-      <w:tr>
-        <w:tc>
-          <w:tcPr>
-            <w:tcW w:w="1705" w:type="dxa"/>
-          </w:tcPr>
-          <w:p>
-            <w:r>
-              <w:t>{{#member-table-loop</w:t>
-            </w:r>
-            <w:proofErr w:type="gramStart"/>
-            <w:r>
-              <w:t>}}{</w:t>
-            </w:r>
-            <w:proofErr w:type="gramEnd"/>
-            <w:r>
-              <w:t>{member-id}}</w:t>
-            </w:r>
-          </w:p>
-        </w:tc>
-        <w:tc>
-          <w:tcPr>
-            <w:tcW w:w="4679" w:type="dxa"/>
-          </w:tcPr>
-          <w:p>
-            <w:r>
-              <w:t>{{member-name}}</w:t>
-            </w:r>
-          </w:p>
-        </w:tc>
-        <w:tc>
-          <w:tcPr>
-            <w:tcW w:w="2966" w:type="dxa"/>
-          </w:tcPr>
-          <w:p>
-            <w:r>
-              <w:t>{{balance}}</w:t>
-            </w:r>
-            <w:r>
-              <w:t>{{</w:t>
-            </w:r>
-            <w:r>
-              <w:t>/</w:t>
-            </w:r>
-            <w:r>
-              <w:t>member-table-loop}}</w:t>
-            </w:r>
-          </w:p>
-        </w:tc>
-      </w:tr>
-    </w:tbl>
-    <w:p/>
-    <w:p/>
-    <w:p/>
-    <w:p/>
-    <w:p/>
-    <w:p/>
-    <w:p/>
+    <w:p>
+      <w:r>
+        <w:t>Name: {{member-name}}</w:t>
+      </w:r>
+    </w:p>
+    <w:p>
+      <w:r>
+        <w:t>Balance: {{balance}}</w:t>
+      </w:r>
+    </w:p>
+    <w:p>
+      <w:r>
+        <w:t>---</w:t>
+      </w:r>
+    </w:p>
+    <w:p>
+      <w:r>
+        <w:t>{{/member-table-loop}}</w:t>
+      </w:r>
+    </w:p>
     <w:sectPr>
       <w:pgSz w:w="12240" w:h="15840"/>
       <w:pgMar w:top="1440" w:right="1440" w:bottom="1440" w:left="1440" w:header="720" w:footer="720" w:gutter="0"/>

</xml_diff>

<commit_message>
Fix Word template - remove formatting from placeholders
</commit_message>
<xml_diff>
--- a/public/report-template.docx
+++ b/public/report-template.docx
@@ -3,178 +3,10 @@
 <w:document xmlns:wpc="http://schemas.microsoft.com/office/word/2010/wordprocessingCanvas" xmlns:cx="http://schemas.microsoft.com/office/drawing/2014/chartex" xmlns:cx1="http://schemas.microsoft.com/office/drawing/2015/9/8/chartex" xmlns:cx2="http://schemas.microsoft.com/office/drawing/2015/10/21/chartex" xmlns:cx3="http://schemas.microsoft.com/office/drawing/2016/5/9/chartex" xmlns:cx4="http://schemas.microsoft.com/office/drawing/2016/5/10/chartex" xmlns:cx5="http://schemas.microsoft.com/office/drawing/2016/5/11/chartex" xmlns:cx6="http://schemas.microsoft.com/office/drawing/2016/5/12/chartex" xmlns:cx7="http://schemas.microsoft.com/office/drawing/2016/5/13/chartex" xmlns:cx8="http://schemas.microsoft.com/office/drawing/2016/5/14/chartex" xmlns:mc="http://schemas.openxmlformats.org/markup-compatibility/2006" xmlns:aink="http://schemas.microsoft.com/office/drawing/2016/ink" xmlns:am3d="http://schemas.microsoft.com/office/drawing/2017/model3d" xmlns:o="urn:schemas-microsoft-com:office:office" xmlns:oel="http://schemas.microsoft.com/office/2019/extlst" xmlns:r="http://schemas.openxmlformats.org/officeDocument/2006/relationships" xmlns:m="http://schemas.openxmlformats.org/officeDocument/2006/math" xmlns:v="urn:schemas-microsoft-com:vml" xmlns:wp14="http://schemas.microsoft.com/office/word/2010/wordprocessingDrawing" xmlns:wp="http://schemas.openxmlformats.org/drawingml/2006/wordprocessingDrawing" xmlns:w10="urn:schemas-microsoft-com:office:word" xmlns:w="http://schemas.openxmlformats.org/wordprocessingml/2006/main" xmlns:w14="http://schemas.microsoft.com/office/word/2010/wordml" xmlns:w15="http://schemas.microsoft.com/office/word/2012/wordml" xmlns:w16cex="http://schemas.microsoft.com/office/word/2018/wordml/cex" xmlns:w16cid="http://schemas.microsoft.com/office/word/2016/wordml/cid" xmlns:w16="http://schemas.microsoft.com/office/word/2018/wordml" xmlns:w16du="http://schemas.microsoft.com/office/word/2023/wordml/word16du" xmlns:w16sdtdh="http://schemas.microsoft.com/office/word/2020/wordml/sdtdatahash" xmlns:w16sdtfl="http://schemas.microsoft.com/office/word/2024/wordml/sdtformatlock" xmlns:w16se="http://schemas.microsoft.com/office/word/2015/wordml/symex" xmlns:wpg="http://schemas.microsoft.com/office/word/2010/wordprocessingGroup" xmlns:wpi="http://schemas.microsoft.com/office/word/2010/wordprocessingInk" xmlns:wne="http://schemas.microsoft.com/office/word/2006/wordml" xmlns:wps="http://schemas.microsoft.com/office/word/2010/wordprocessingShape" mc:Ignorable="w14 w15 w16se w16cid w16 w16cex w16sdtdh w16sdtfl w16du wp14">
   <w:body>
     <w:p>
-      <w:pPr>
-        <w:jc w:val="center"/>
-      </w:pPr>
       <w:r>
-        <w:rPr>
-          <w:noProof/>
-        </w:rPr>
-        <w:drawing>
-          <wp:anchor distT="0" distB="0" distL="114300" distR="114300" simplePos="0" relativeHeight="251658240" behindDoc="0" locked="0" layoutInCell="1" allowOverlap="1" wp14:anchorId="01764014" wp14:editId="49B5481F">
-            <wp:simplePos x="0" y="0"/>
-            <wp:positionH relativeFrom="margin">
-              <wp:align>center</wp:align>
-            </wp:positionH>
-            <wp:positionV relativeFrom="paragraph">
-              <wp:posOffset>-775617</wp:posOffset>
-            </wp:positionV>
-            <wp:extent cx="4140200" cy="3136900"/>
-            <wp:effectExtent l="0" t="0" r="0" b="0"/>
-            <wp:wrapNone/>
-            <wp:docPr id="244501243" name="Picture 1"/>
-            <wp:cNvGraphicFramePr>
-              <a:graphicFrameLocks xmlns:a="http://schemas.openxmlformats.org/drawingml/2006/main" noChangeAspect="1"/>
-            </wp:cNvGraphicFramePr>
-            <a:graphic xmlns:a="http://schemas.openxmlformats.org/drawingml/2006/main">
-              <a:graphicData uri="http://schemas.openxmlformats.org/drawingml/2006/picture">
-                <pic:pic xmlns:pic="http://schemas.openxmlformats.org/drawingml/2006/picture">
-                  <pic:nvPicPr>
-                    <pic:cNvPr id="244501243" name="Picture 244501243"/>
-                    <pic:cNvPicPr/>
-                  </pic:nvPicPr>
-                  <pic:blipFill>
-                    <a:blip r:embed="rId4">
-                      <a:extLst>
-                        <a:ext uri="{28A0092B-C50C-407E-A947-70E740481C1C}">
-                          <a14:useLocalDpi xmlns:a14="http://schemas.microsoft.com/office/drawing/2010/main" val="0"/>
-                        </a:ext>
-                      </a:extLst>
-                    </a:blip>
-                    <a:stretch>
-                      <a:fillRect/>
-                    </a:stretch>
-                  </pic:blipFill>
-                  <pic:spPr>
-                    <a:xfrm>
-                      <a:off x="0" y="0"/>
-                      <a:ext cx="4140200" cy="3136900"/>
-                    </a:xfrm>
-                    <a:prstGeom prst="rect">
-                      <a:avLst/>
-                    </a:prstGeom>
-                  </pic:spPr>
-                </pic:pic>
-              </a:graphicData>
-            </a:graphic>
-            <wp14:sizeRelH relativeFrom="page">
-              <wp14:pctWidth>0</wp14:pctWidth>
-            </wp14:sizeRelH>
-            <wp14:sizeRelV relativeFrom="page">
-              <wp14:pctHeight>0</wp14:pctHeight>
-            </wp14:sizeRelV>
-          </wp:anchor>
-        </w:drawing>
-      </w:r>
-      <w:r>
-        <w:br/>
-      </w:r>
-      <w:r>
-        <w:br/>
-      </w:r>
-      <w:r>
-        <w:br/>
-      </w:r>
-      <w:r>
-        <w:br/>
-      </w:r>
-      <w:r>
-        <w:br/>
-      </w:r>
-      <w:r>
-        <w:br/>
-      </w:r>
-      <w:r>
-        <w:br/>
-      </w:r>
-      <w:r>
-        <w:br/>
-      </w:r>
-      <w:r>
-        <w:br/>
-      </w:r>
-      <w:r>
-        <w:br/>
-      </w:r>
-      <w:r>
-        <w:br/>
-      </w:r>
-      <w:r>
-        <w:br/>
-      </w:r>
-      <w:r>
-        <w:br/>
+        <w:t>Date: {{date}}</w:t>
       </w:r>
     </w:p>
-    <w:p>
-      <w:pPr>
-        <w:jc w:val="center"/>
-        <w:rPr>
-          <w:b/>
-          <w:bCs/>
-          <w:sz w:val="60"/>
-          <w:szCs w:val="60"/>
-        </w:rPr>
-      </w:pPr>
-      <w:r>
-        <w:rPr>
-          <w:b/>
-          <w:bCs/>
-          <w:sz w:val="60"/>
-          <w:szCs w:val="60"/>
-        </w:rPr>
-        <w:t>MESAQ COMMUNITY REPORT</w:t>
-      </w:r>
-    </w:p>
-    <w:p>
-      <w:pPr>
-        <w:jc w:val="center"/>
-        <w:rPr>
-          <w:b/>
-          <w:bCs/>
-          <w:sz w:val="60"/>
-          <w:szCs w:val="60"/>
-        </w:rPr>
-      </w:pPr>
-      <w:r>
-        <w:rPr>
-          <w:b/>
-          <w:bCs/>
-          <w:sz w:val="60"/>
-          <w:szCs w:val="60"/>
-        </w:rPr>
-        <w:t>{{date}}</w:t>
-      </w:r>
-    </w:p>
-    <w:p/>
-    <w:p/>
-    <w:p/>
-    <w:p/>
-    <w:p/>
-    <w:p/>
-    <w:p/>
-    <w:p/>
-    <w:p/>
-    <w:p/>
-    <w:p/>
-    <w:p/>
-    <w:p>
-      <w:pPr>
-        <w:rPr>
-          <w:sz w:val="40"/>
-          <w:szCs w:val="40"/>
-        </w:rPr>
-      </w:pPr>
-      <w:r>
-        <w:rPr>
-          <w:sz w:val="40"/>
-          <w:szCs w:val="40"/>
-        </w:rPr>
-        <w:lastRenderedPageBreak/>
-        <w:t>Member Balances</w:t>
-      </w:r>
-    </w:p>
-    <w:p/>
     <w:tbl>
       <w:tblPr>
         <w:tblStyle w:val="TableGrid"/>
@@ -182,70 +14,37 @@
         <w:tblLook w:val="04A0" w:firstRow="1" w:lastRow="0" w:firstColumn="1" w:lastColumn="0" w:noHBand="0" w:noVBand="1"/>
       </w:tblPr>
       <w:tblGrid>
-        <w:gridCol w:w="1910"/>
-        <w:gridCol w:w="4499"/>
-        <w:gridCol w:w="2941"/>
+        <w:gridCol w:w="3116"/>
+        <w:gridCol w:w="3117"/>
+        <w:gridCol w:w="3117"/>
       </w:tblGrid>
       <w:tr>
         <w:tc>
           <w:tcPr>
-            <w:tcW w:w="1705" w:type="dxa"/>
-            <w:shd w:val="clear" w:color="auto" w:fill="32AF4D"/>
+            <w:tcW w:w="3116" w:type="dxa"/>
           </w:tcPr>
           <w:p>
-            <w:pPr>
-              <w:rPr>
-                <w:sz w:val="32"/>
-                <w:szCs w:val="32"/>
-              </w:rPr>
-            </w:pPr>
             <w:r>
-              <w:rPr>
-                <w:sz w:val="32"/>
-                <w:szCs w:val="32"/>
-              </w:rPr>
-              <w:t>Member ID</w:t>
+              <w:t>ID</w:t>
             </w:r>
           </w:p>
         </w:tc>
         <w:tc>
           <w:tcPr>
-            <w:tcW w:w="4679" w:type="dxa"/>
-            <w:shd w:val="clear" w:color="auto" w:fill="32AF4D"/>
+            <w:tcW w:w="3117" w:type="dxa"/>
           </w:tcPr>
           <w:p>
-            <w:pPr>
-              <w:rPr>
-                <w:sz w:val="32"/>
-                <w:szCs w:val="32"/>
-              </w:rPr>
-            </w:pPr>
             <w:r>
-              <w:rPr>
-                <w:sz w:val="32"/>
-                <w:szCs w:val="32"/>
-              </w:rPr>
-              <w:t>Member Name</w:t>
+              <w:t>Name</w:t>
             </w:r>
           </w:p>
         </w:tc>
         <w:tc>
           <w:tcPr>
-            <w:tcW w:w="2966" w:type="dxa"/>
-            <w:shd w:val="clear" w:color="auto" w:fill="32AF4D"/>
+            <w:tcW w:w="3117" w:type="dxa"/>
           </w:tcPr>
           <w:p>
-            <w:pPr>
-              <w:rPr>
-                <w:sz w:val="32"/>
-                <w:szCs w:val="32"/>
-              </w:rPr>
-            </w:pPr>
             <w:r>
-              <w:rPr>
-                <w:sz w:val="32"/>
-                <w:szCs w:val="32"/>
-              </w:rPr>
               <w:t>Balance</w:t>
             </w:r>
           </w:p>
@@ -254,7 +53,7 @@
       <w:tr>
         <w:tc>
           <w:tcPr>
-            <w:tcW w:w="1705" w:type="dxa"/>
+            <w:tcW w:w="3116" w:type="dxa"/>
           </w:tcPr>
           <w:p>
             <w:r>
@@ -266,47 +65,50 @@
             </w:r>
             <w:proofErr w:type="gramEnd"/>
             <w:r>
-              <w:t>{member-id}}</w:t>
+              <w:t xml:space="preserve">{member-id}}    </w:t>
+            </w:r>
+          </w:p>
+          <w:p/>
+        </w:tc>
+        <w:tc>
+          <w:tcPr>
+            <w:tcW w:w="3117" w:type="dxa"/>
+          </w:tcPr>
+          <w:p>
+            <w:r>
+              <w:t>{{member-name</w:t>
+            </w:r>
+            <w:proofErr w:type="gramStart"/>
+            <w:r>
+              <w:t xml:space="preserve">}}   </w:t>
+            </w:r>
+            <w:proofErr w:type="gramEnd"/>
+            <w:r>
+              <w:t xml:space="preserve"> </w:t>
             </w:r>
           </w:p>
         </w:tc>
         <w:tc>
           <w:tcPr>
-            <w:tcW w:w="4679" w:type="dxa"/>
+            <w:tcW w:w="3117" w:type="dxa"/>
           </w:tcPr>
           <w:p>
             <w:r>
-              <w:t>{{member-name}}</w:t>
+              <w:t>{{balance</w:t>
+            </w:r>
+            <w:proofErr w:type="gramStart"/>
+            <w:r>
+              <w:t>}}{</w:t>
+            </w:r>
+            <w:proofErr w:type="gramEnd"/>
+            <w:r>
+              <w:t>{/member-table-loop}}</w:t>
             </w:r>
           </w:p>
-        </w:tc>
-        <w:tc>
-          <w:tcPr>
-            <w:tcW w:w="2966" w:type="dxa"/>
-          </w:tcPr>
-          <w:p>
-            <w:r>
-              <w:t>{{balance}}</w:t>
-            </w:r>
-            <w:r>
-              <w:t>{{</w:t>
-            </w:r>
-            <w:r>
-              <w:t>/</w:t>
-            </w:r>
-            <w:r>
-              <w:t>member-table-loop}}</w:t>
-            </w:r>
-          </w:p>
+          <w:p/>
         </w:tc>
       </w:tr>
     </w:tbl>
-    <w:p/>
-    <w:p/>
-    <w:p/>
-    <w:p/>
-    <w:p/>
-    <w:p/>
     <w:p/>
     <w:sectPr>
       <w:pgSz w:w="12240" w:h="15840"/>
@@ -921,7 +723,6 @@
   <w:style w:type="character" w:default="1" w:styleId="DefaultParagraphFont">
     <w:name w:val="Default Paragraph Font"/>
     <w:uiPriority w:val="1"/>
-    <w:semiHidden/>
     <w:unhideWhenUsed/>
   </w:style>
   <w:style w:type="table" w:default="1" w:styleId="TableNormal">

</xml_diff>